<commit_message>
republishing mod 10 with rosa feedback
</commit_message>
<xml_diff>
--- a/EDI_Publishing/Macrosystems_EDDIE_Module_10_DecisionTradeoffs/Editable_versions_all_files/Instructor_Manual_Module10.docx
+++ b/EDI_Publishing/Macrosystems_EDDIE_Module_10_DecisionTradeoffs/Editable_versions_all_files/Instructor_Manual_Module10.docx
@@ -3796,27 +3796,7 @@
           <w:szCs w:val="23"/>
           <w:shd w:val="clear" w:color="auto" w:fill="FFFFFF"/>
         </w:rPr>
-        <w:t>A modular curriculum to teach undergraduates ecological forecasting improves student and instructor confidence in their data science skills</w:t>
-      </w:r>
-      <w:r>
-        <w:rPr>
-          <w:rFonts w:ascii="Source Sans Pro" w:hAnsi="Source Sans Pro"/>
-          <w:color w:val="2A2A2A"/>
-          <w:sz w:val="23"/>
-          <w:szCs w:val="23"/>
-          <w:shd w:val="clear" w:color="auto" w:fill="FFFFFF"/>
-        </w:rPr>
-        <w:t>.</w:t>
-      </w:r>
-      <w:r>
-        <w:rPr>
-          <w:rFonts w:ascii="Source Sans Pro" w:hAnsi="Source Sans Pro"/>
-          <w:color w:val="2A2A2A"/>
-          <w:sz w:val="23"/>
-          <w:szCs w:val="23"/>
-          <w:shd w:val="clear" w:color="auto" w:fill="FFFFFF"/>
-        </w:rPr>
-        <w:t> </w:t>
+        <w:t>A modular curriculum to teach undergraduates ecological forecasting improves student and instructor confidence in their data science skills. </w:t>
       </w:r>
       <w:proofErr w:type="spellStart"/>
       <w:r>
@@ -3840,67 +3820,7 @@
           <w:szCs w:val="23"/>
           <w:shd w:val="clear" w:color="auto" w:fill="FFFFFF"/>
         </w:rPr>
-        <w:t xml:space="preserve"> 75</w:t>
-      </w:r>
-      <w:r>
-        <w:rPr>
-          <w:rFonts w:ascii="Source Sans Pro" w:hAnsi="Source Sans Pro"/>
-          <w:color w:val="2A2A2A"/>
-          <w:sz w:val="23"/>
-          <w:szCs w:val="23"/>
-          <w:shd w:val="clear" w:color="auto" w:fill="FFFFFF"/>
-        </w:rPr>
-        <w:t xml:space="preserve"> (</w:t>
-      </w:r>
-      <w:r>
-        <w:rPr>
-          <w:rFonts w:ascii="Source Sans Pro" w:hAnsi="Source Sans Pro"/>
-          <w:color w:val="2A2A2A"/>
-          <w:sz w:val="23"/>
-          <w:szCs w:val="23"/>
-          <w:shd w:val="clear" w:color="auto" w:fill="FFFFFF"/>
-        </w:rPr>
-        <w:t>2</w:t>
-      </w:r>
-      <w:r>
-        <w:rPr>
-          <w:rFonts w:ascii="Source Sans Pro" w:hAnsi="Source Sans Pro"/>
-          <w:color w:val="2A2A2A"/>
-          <w:sz w:val="23"/>
-          <w:szCs w:val="23"/>
-          <w:shd w:val="clear" w:color="auto" w:fill="FFFFFF"/>
-        </w:rPr>
-        <w:t xml:space="preserve">): </w:t>
-      </w:r>
-      <w:r>
-        <w:rPr>
-          <w:rFonts w:ascii="Source Sans Pro" w:hAnsi="Source Sans Pro"/>
-          <w:color w:val="2A2A2A"/>
-          <w:sz w:val="23"/>
-          <w:szCs w:val="23"/>
-          <w:shd w:val="clear" w:color="auto" w:fill="FFFFFF"/>
-        </w:rPr>
-        <w:t>127–138</w:t>
-      </w:r>
-      <w:r>
-        <w:rPr>
-          <w:rFonts w:ascii="Source Sans Pro" w:hAnsi="Source Sans Pro"/>
-          <w:color w:val="2A2A2A"/>
-          <w:sz w:val="23"/>
-          <w:szCs w:val="23"/>
-          <w:shd w:val="clear" w:color="auto" w:fill="FFFFFF"/>
-        </w:rPr>
-        <w:t>. DOI:</w:t>
-      </w:r>
-      <w:r>
-        <w:rPr>
-          <w:rFonts w:ascii="Source Sans Pro" w:hAnsi="Source Sans Pro"/>
-          <w:color w:val="2A2A2A"/>
-          <w:sz w:val="23"/>
-          <w:szCs w:val="23"/>
-          <w:shd w:val="clear" w:color="auto" w:fill="FFFFFF"/>
-        </w:rPr>
-        <w:t> </w:t>
+        <w:t xml:space="preserve"> 75 (2): 127–138. DOI: </w:t>
       </w:r>
       <w:hyperlink r:id="rId10" w:history="1">
         <w:r>
@@ -6743,7 +6663,21 @@
           <w:rFonts w:ascii="Aptos Narrow" w:hAnsi="Aptos Narrow"/>
           <w:color w:val="000000"/>
         </w:rPr>
-        <w:t xml:space="preserve">For Feb. 20, what is the corresponding TOC in mg/L of the </w:t>
+        <w:t>For Feb</w:t>
+      </w:r>
+      <w:r>
+        <w:rPr>
+          <w:rFonts w:ascii="Aptos Narrow" w:hAnsi="Aptos Narrow"/>
+          <w:color w:val="000000"/>
+        </w:rPr>
+        <w:t>ruary</w:t>
+      </w:r>
+      <w:r>
+        <w:rPr>
+          <w:rFonts w:ascii="Aptos Narrow" w:hAnsi="Aptos Narrow"/>
+          <w:color w:val="000000"/>
+        </w:rPr>
+        <w:t xml:space="preserve"> 20, what is the corresponding TOC in mg/L of the </w:t>
       </w:r>
       <w:proofErr w:type="spellStart"/>
       <w:r>
@@ -6790,7 +6724,7 @@
           <w:rFonts w:ascii="Aptos Narrow" w:hAnsi="Aptos Narrow"/>
           <w:color w:val="000000"/>
         </w:rPr>
-        <w:t xml:space="preserve">* 8.3 </w:t>
+        <w:t>* 3.5</w:t>
       </w:r>
     </w:p>
     <w:p>
@@ -6820,6 +6754,72 @@
           <w:rFonts w:ascii="Aptos Narrow" w:hAnsi="Aptos Narrow"/>
           <w:color w:val="000000"/>
         </w:rPr>
+        <w:t>Use your answer to Q28 and the required removal of TOC table to calculate how much TOC</w:t>
+      </w:r>
+      <w:r>
+        <w:rPr>
+          <w:rFonts w:ascii="Aptos Narrow" w:hAnsi="Aptos Narrow"/>
+          <w:color w:val="000000"/>
+        </w:rPr>
+        <w:t xml:space="preserve"> </w:t>
+      </w:r>
+      <w:r>
+        <w:rPr>
+          <w:rFonts w:ascii="Aptos Narrow" w:hAnsi="Aptos Narrow"/>
+          <w:color w:val="000000"/>
+        </w:rPr>
+        <w:t>in mg/L</w:t>
+      </w:r>
+      <w:r>
+        <w:rPr>
+          <w:rFonts w:ascii="Aptos Narrow" w:hAnsi="Aptos Narrow"/>
+          <w:color w:val="000000"/>
+        </w:rPr>
+        <w:t xml:space="preserve"> should be removed from the reservoir on February 20. Round your answer to the nearest tenth (e.g., 3.1).</w:t>
+      </w:r>
+    </w:p>
+    <w:p>
+      <w:pPr>
+        <w:rPr>
+          <w:rFonts w:ascii="Aptos Narrow" w:hAnsi="Aptos Narrow"/>
+          <w:color w:val="000000"/>
+        </w:rPr>
+      </w:pPr>
+      <w:r>
+        <w:rPr>
+          <w:rFonts w:ascii="Aptos Narrow" w:hAnsi="Aptos Narrow"/>
+          <w:color w:val="000000"/>
+        </w:rPr>
+        <w:t xml:space="preserve">* 1.2 </w:t>
+      </w:r>
+    </w:p>
+    <w:p>
+      <w:pPr>
+        <w:rPr>
+          <w:rFonts w:ascii="Aptos Narrow" w:hAnsi="Aptos Narrow"/>
+          <w:color w:val="000000"/>
+        </w:rPr>
+      </w:pPr>
+    </w:p>
+    <w:p>
+      <w:pPr>
+        <w:rPr>
+          <w:rFonts w:ascii="Aptos Narrow" w:hAnsi="Aptos Narrow"/>
+          <w:color w:val="000000"/>
+        </w:rPr>
+      </w:pPr>
+      <w:r>
+        <w:rPr>
+          <w:rFonts w:ascii="Aptos Narrow" w:hAnsi="Aptos Narrow"/>
+          <w:color w:val="000000"/>
+        </w:rPr>
+        <w:t xml:space="preserve">30. </w:t>
+      </w:r>
+      <w:r>
+        <w:rPr>
+          <w:rFonts w:ascii="Aptos Narrow" w:hAnsi="Aptos Narrow"/>
+          <w:color w:val="000000"/>
+        </w:rPr>
         <w:t xml:space="preserve">Which best describes the pattern in </w:t>
       </w:r>
       <w:proofErr w:type="spellStart"/>
@@ -6926,7 +6926,7 @@
           <w:rFonts w:ascii="Aptos Narrow" w:hAnsi="Aptos Narrow"/>
           <w:color w:val="000000"/>
         </w:rPr>
-        <w:t xml:space="preserve">30. </w:t>
+        <w:t xml:space="preserve">31. </w:t>
       </w:r>
       <w:r>
         <w:rPr>
@@ -6940,7 +6940,23 @@
           <w:rFonts w:ascii="Aptos Narrow" w:hAnsi="Aptos Narrow"/>
           <w:color w:val="000000"/>
         </w:rPr>
-        <w:t xml:space="preserve"> Type ‘yes’ or ‘no’.</w:t>
+        <w:t xml:space="preserve"> Type ‘</w:t>
+      </w:r>
+      <w:proofErr w:type="spellStart"/>
+      <w:r>
+        <w:rPr>
+          <w:rFonts w:ascii="Aptos Narrow" w:hAnsi="Aptos Narrow"/>
+          <w:color w:val="000000"/>
+        </w:rPr>
+        <w:t>yes’</w:t>
+      </w:r>
+      <w:proofErr w:type="spellEnd"/>
+      <w:r>
+        <w:rPr>
+          <w:rFonts w:ascii="Aptos Narrow" w:hAnsi="Aptos Narrow"/>
+          <w:color w:val="000000"/>
+        </w:rPr>
+        <w:t xml:space="preserve"> or ‘no’.</w:t>
       </w:r>
     </w:p>
     <w:p>
@@ -7011,14 +7027,28 @@
           <w:rFonts w:ascii="Aptos Narrow" w:hAnsi="Aptos Narrow"/>
           <w:color w:val="000000"/>
         </w:rPr>
-        <w:t xml:space="preserve">31. </w:t>
-      </w:r>
-      <w:r>
-        <w:rPr>
-          <w:rFonts w:ascii="Aptos Narrow" w:hAnsi="Aptos Narrow"/>
-          <w:color w:val="000000"/>
-        </w:rPr>
-        <w:t xml:space="preserve">For Apr. 15, what is the corresponding TOC in mg/L of the </w:t>
+        <w:t xml:space="preserve">32. </w:t>
+      </w:r>
+      <w:r>
+        <w:rPr>
+          <w:rFonts w:ascii="Aptos Narrow" w:hAnsi="Aptos Narrow"/>
+          <w:color w:val="000000"/>
+        </w:rPr>
+        <w:t>For Apr</w:t>
+      </w:r>
+      <w:r>
+        <w:rPr>
+          <w:rFonts w:ascii="Aptos Narrow" w:hAnsi="Aptos Narrow"/>
+          <w:color w:val="000000"/>
+        </w:rPr>
+        <w:t>il</w:t>
+      </w:r>
+      <w:r>
+        <w:rPr>
+          <w:rFonts w:ascii="Aptos Narrow" w:hAnsi="Aptos Narrow"/>
+          <w:color w:val="000000"/>
+        </w:rPr>
+        <w:t xml:space="preserve"> 15, what is the corresponding TOC in mg/L of the </w:t>
       </w:r>
       <w:proofErr w:type="spellStart"/>
       <w:r>
@@ -7065,30 +7095,124 @@
           <w:rFonts w:ascii="Aptos Narrow" w:hAnsi="Aptos Narrow"/>
           <w:color w:val="000000"/>
         </w:rPr>
-        <w:t xml:space="preserve">* 9.2 </w:t>
-      </w:r>
-    </w:p>
-    <w:p>
-      <w:pPr>
-        <w:rPr>
-          <w:rFonts w:ascii="Aptos Narrow" w:hAnsi="Aptos Narrow"/>
-          <w:color w:val="000000"/>
-        </w:rPr>
-      </w:pPr>
-    </w:p>
-    <w:p>
-      <w:pPr>
-        <w:rPr>
-          <w:rFonts w:ascii="Aptos Narrow" w:hAnsi="Aptos Narrow"/>
-          <w:color w:val="000000"/>
-        </w:rPr>
-      </w:pPr>
-      <w:r>
-        <w:rPr>
-          <w:rFonts w:ascii="Aptos Narrow" w:hAnsi="Aptos Narrow"/>
-          <w:color w:val="000000"/>
-        </w:rPr>
-        <w:t xml:space="preserve">32. </w:t>
+        <w:t xml:space="preserve">* 5.0 </w:t>
+      </w:r>
+    </w:p>
+    <w:p>
+      <w:pPr>
+        <w:rPr>
+          <w:rFonts w:ascii="Aptos Narrow" w:hAnsi="Aptos Narrow"/>
+          <w:color w:val="000000"/>
+        </w:rPr>
+      </w:pPr>
+    </w:p>
+    <w:p>
+      <w:pPr>
+        <w:rPr>
+          <w:rFonts w:ascii="Aptos Narrow" w:hAnsi="Aptos Narrow"/>
+          <w:color w:val="000000"/>
+        </w:rPr>
+      </w:pPr>
+      <w:r>
+        <w:rPr>
+          <w:rFonts w:ascii="Aptos Narrow" w:hAnsi="Aptos Narrow"/>
+          <w:color w:val="000000"/>
+        </w:rPr>
+        <w:t xml:space="preserve">33. </w:t>
+      </w:r>
+      <w:r>
+        <w:rPr>
+          <w:rFonts w:ascii="Aptos Narrow" w:hAnsi="Aptos Narrow"/>
+          <w:color w:val="000000"/>
+        </w:rPr>
+        <w:t>Use your answer to Q</w:t>
+      </w:r>
+      <w:r>
+        <w:rPr>
+          <w:rFonts w:ascii="Aptos Narrow" w:hAnsi="Aptos Narrow"/>
+          <w:color w:val="000000"/>
+        </w:rPr>
+        <w:t>33</w:t>
+      </w:r>
+      <w:r>
+        <w:rPr>
+          <w:rFonts w:ascii="Aptos Narrow" w:hAnsi="Aptos Narrow"/>
+          <w:color w:val="000000"/>
+        </w:rPr>
+        <w:t xml:space="preserve"> and the required removal of TOC table to calculate how much TOC</w:t>
+      </w:r>
+      <w:r>
+        <w:rPr>
+          <w:rFonts w:ascii="Aptos Narrow" w:hAnsi="Aptos Narrow"/>
+          <w:color w:val="000000"/>
+        </w:rPr>
+        <w:t xml:space="preserve"> </w:t>
+      </w:r>
+      <w:r>
+        <w:rPr>
+          <w:rFonts w:ascii="Aptos Narrow" w:hAnsi="Aptos Narrow"/>
+          <w:color w:val="000000"/>
+        </w:rPr>
+        <w:t>in mg/L</w:t>
+      </w:r>
+      <w:r>
+        <w:rPr>
+          <w:rFonts w:ascii="Aptos Narrow" w:hAnsi="Aptos Narrow"/>
+          <w:color w:val="000000"/>
+        </w:rPr>
+        <w:t xml:space="preserve"> should be removed from the reservoir on </w:t>
+      </w:r>
+      <w:r>
+        <w:rPr>
+          <w:rFonts w:ascii="Aptos Narrow" w:hAnsi="Aptos Narrow"/>
+          <w:color w:val="000000"/>
+        </w:rPr>
+        <w:t>April 15</w:t>
+      </w:r>
+      <w:r>
+        <w:rPr>
+          <w:rFonts w:ascii="Aptos Narrow" w:hAnsi="Aptos Narrow"/>
+          <w:color w:val="000000"/>
+        </w:rPr>
+        <w:t>. Round your answer to the nearest tenth (e.g., 3.1).</w:t>
+      </w:r>
+    </w:p>
+    <w:p>
+      <w:pPr>
+        <w:rPr>
+          <w:rFonts w:ascii="Aptos Narrow" w:hAnsi="Aptos Narrow"/>
+          <w:color w:val="000000"/>
+        </w:rPr>
+      </w:pPr>
+      <w:r>
+        <w:rPr>
+          <w:rFonts w:ascii="Aptos Narrow" w:hAnsi="Aptos Narrow"/>
+          <w:color w:val="000000"/>
+        </w:rPr>
+        <w:t>* 2.3</w:t>
+      </w:r>
+    </w:p>
+    <w:p>
+      <w:pPr>
+        <w:rPr>
+          <w:rFonts w:ascii="Aptos Narrow" w:hAnsi="Aptos Narrow"/>
+          <w:color w:val="000000"/>
+        </w:rPr>
+      </w:pPr>
+    </w:p>
+    <w:p>
+      <w:pPr>
+        <w:rPr>
+          <w:rFonts w:ascii="Aptos Narrow" w:hAnsi="Aptos Narrow"/>
+          <w:color w:val="000000"/>
+        </w:rPr>
+      </w:pPr>
+      <w:r>
+        <w:rPr>
+          <w:rFonts w:ascii="Aptos Narrow" w:hAnsi="Aptos Narrow"/>
+          <w:color w:val="000000"/>
+        </w:rPr>
+        <w:t xml:space="preserve">34. </w:t>
       </w:r>
       <w:r>
         <w:rPr>
@@ -7156,6 +7280,7 @@
           <w:rFonts w:ascii="Aptos Narrow" w:hAnsi="Aptos Narrow"/>
           <w:color w:val="000000"/>
         </w:rPr>
+        <w:lastRenderedPageBreak/>
         <w:t>c) steady (very little change)</w:t>
       </w:r>
     </w:p>
@@ -7201,7 +7326,7 @@
           <w:rFonts w:ascii="Aptos Narrow" w:hAnsi="Aptos Narrow"/>
           <w:color w:val="000000"/>
         </w:rPr>
-        <w:t xml:space="preserve">33. </w:t>
+        <w:t xml:space="preserve">35. </w:t>
       </w:r>
       <w:r>
         <w:rPr>
@@ -7215,7 +7340,23 @@
           <w:rFonts w:ascii="Aptos Narrow" w:hAnsi="Aptos Narrow"/>
           <w:color w:val="000000"/>
         </w:rPr>
-        <w:t xml:space="preserve"> Type ‘yes’ or ‘no’.</w:t>
+        <w:t xml:space="preserve"> Type ‘</w:t>
+      </w:r>
+      <w:proofErr w:type="spellStart"/>
+      <w:r>
+        <w:rPr>
+          <w:rFonts w:ascii="Aptos Narrow" w:hAnsi="Aptos Narrow"/>
+          <w:color w:val="000000"/>
+        </w:rPr>
+        <w:t>yes’</w:t>
+      </w:r>
+      <w:proofErr w:type="spellEnd"/>
+      <w:r>
+        <w:rPr>
+          <w:rFonts w:ascii="Aptos Narrow" w:hAnsi="Aptos Narrow"/>
+          <w:color w:val="000000"/>
+        </w:rPr>
+        <w:t xml:space="preserve"> or ‘no’.</w:t>
       </w:r>
     </w:p>
     <w:p>
@@ -7286,15 +7427,28 @@
           <w:rFonts w:ascii="Aptos Narrow" w:hAnsi="Aptos Narrow"/>
           <w:color w:val="000000"/>
         </w:rPr>
-        <w:lastRenderedPageBreak/>
-        <w:t xml:space="preserve">34. </w:t>
-      </w:r>
-      <w:r>
-        <w:rPr>
-          <w:rFonts w:ascii="Aptos Narrow" w:hAnsi="Aptos Narrow"/>
-          <w:color w:val="000000"/>
-        </w:rPr>
-        <w:t xml:space="preserve">For Aug. 20, what is the corresponding TOC in mg/L of the </w:t>
+        <w:t xml:space="preserve">36. </w:t>
+      </w:r>
+      <w:r>
+        <w:rPr>
+          <w:rFonts w:ascii="Aptos Narrow" w:hAnsi="Aptos Narrow"/>
+          <w:color w:val="000000"/>
+        </w:rPr>
+        <w:t>For Aug</w:t>
+      </w:r>
+      <w:r>
+        <w:rPr>
+          <w:rFonts w:ascii="Aptos Narrow" w:hAnsi="Aptos Narrow"/>
+          <w:color w:val="000000"/>
+        </w:rPr>
+        <w:t>ust</w:t>
+      </w:r>
+      <w:r>
+        <w:rPr>
+          <w:rFonts w:ascii="Aptos Narrow" w:hAnsi="Aptos Narrow"/>
+          <w:color w:val="000000"/>
+        </w:rPr>
+        <w:t xml:space="preserve"> 20, what is the corresponding TOC in mg/L of the </w:t>
       </w:r>
       <w:proofErr w:type="spellStart"/>
       <w:r>
@@ -7341,30 +7495,124 @@
           <w:rFonts w:ascii="Aptos Narrow" w:hAnsi="Aptos Narrow"/>
           <w:color w:val="000000"/>
         </w:rPr>
-        <w:t xml:space="preserve">* 13.2 </w:t>
-      </w:r>
-    </w:p>
-    <w:p>
-      <w:pPr>
-        <w:rPr>
-          <w:rFonts w:ascii="Aptos Narrow" w:hAnsi="Aptos Narrow"/>
-          <w:color w:val="000000"/>
-        </w:rPr>
-      </w:pPr>
-    </w:p>
-    <w:p>
-      <w:pPr>
-        <w:rPr>
-          <w:rFonts w:ascii="Aptos Narrow" w:hAnsi="Aptos Narrow"/>
-          <w:color w:val="000000"/>
-        </w:rPr>
-      </w:pPr>
-      <w:r>
-        <w:rPr>
-          <w:rFonts w:ascii="Aptos Narrow" w:hAnsi="Aptos Narrow"/>
-          <w:color w:val="000000"/>
-        </w:rPr>
-        <w:t xml:space="preserve">35. </w:t>
+        <w:t xml:space="preserve">* 9.0 </w:t>
+      </w:r>
+    </w:p>
+    <w:p>
+      <w:pPr>
+        <w:rPr>
+          <w:rFonts w:ascii="Aptos Narrow" w:hAnsi="Aptos Narrow"/>
+          <w:color w:val="000000"/>
+        </w:rPr>
+      </w:pPr>
+    </w:p>
+    <w:p>
+      <w:pPr>
+        <w:rPr>
+          <w:rFonts w:ascii="Aptos Narrow" w:hAnsi="Aptos Narrow"/>
+          <w:color w:val="000000"/>
+        </w:rPr>
+      </w:pPr>
+      <w:r>
+        <w:rPr>
+          <w:rFonts w:ascii="Aptos Narrow" w:hAnsi="Aptos Narrow"/>
+          <w:color w:val="000000"/>
+        </w:rPr>
+        <w:t xml:space="preserve">37. </w:t>
+      </w:r>
+      <w:r>
+        <w:rPr>
+          <w:rFonts w:ascii="Aptos Narrow" w:hAnsi="Aptos Narrow"/>
+          <w:color w:val="000000"/>
+        </w:rPr>
+        <w:t>Use your answer to Q</w:t>
+      </w:r>
+      <w:r>
+        <w:rPr>
+          <w:rFonts w:ascii="Aptos Narrow" w:hAnsi="Aptos Narrow"/>
+          <w:color w:val="000000"/>
+        </w:rPr>
+        <w:t>36</w:t>
+      </w:r>
+      <w:r>
+        <w:rPr>
+          <w:rFonts w:ascii="Aptos Narrow" w:hAnsi="Aptos Narrow"/>
+          <w:color w:val="000000"/>
+        </w:rPr>
+        <w:t xml:space="preserve"> and the required removal of TOC table to calculate how much TOC</w:t>
+      </w:r>
+      <w:r>
+        <w:rPr>
+          <w:rFonts w:ascii="Aptos Narrow" w:hAnsi="Aptos Narrow"/>
+          <w:color w:val="000000"/>
+        </w:rPr>
+        <w:t xml:space="preserve"> </w:t>
+      </w:r>
+      <w:r>
+        <w:rPr>
+          <w:rFonts w:ascii="Aptos Narrow" w:hAnsi="Aptos Narrow"/>
+          <w:color w:val="000000"/>
+        </w:rPr>
+        <w:t>in mg/L</w:t>
+      </w:r>
+      <w:r>
+        <w:rPr>
+          <w:rFonts w:ascii="Aptos Narrow" w:hAnsi="Aptos Narrow"/>
+          <w:color w:val="000000"/>
+        </w:rPr>
+        <w:t xml:space="preserve"> should be removed from the reservoir on </w:t>
+      </w:r>
+      <w:r>
+        <w:rPr>
+          <w:rFonts w:ascii="Aptos Narrow" w:hAnsi="Aptos Narrow"/>
+          <w:color w:val="000000"/>
+        </w:rPr>
+        <w:t>August 20</w:t>
+      </w:r>
+      <w:r>
+        <w:rPr>
+          <w:rFonts w:ascii="Aptos Narrow" w:hAnsi="Aptos Narrow"/>
+          <w:color w:val="000000"/>
+        </w:rPr>
+        <w:t>. Round your answer to the nearest tenth (e.g., 3.1).</w:t>
+      </w:r>
+    </w:p>
+    <w:p>
+      <w:pPr>
+        <w:rPr>
+          <w:rFonts w:ascii="Aptos Narrow" w:hAnsi="Aptos Narrow"/>
+          <w:color w:val="000000"/>
+        </w:rPr>
+      </w:pPr>
+      <w:r>
+        <w:rPr>
+          <w:rFonts w:ascii="Aptos Narrow" w:hAnsi="Aptos Narrow"/>
+          <w:color w:val="000000"/>
+        </w:rPr>
+        <w:t>* 4.5</w:t>
+      </w:r>
+    </w:p>
+    <w:p>
+      <w:pPr>
+        <w:rPr>
+          <w:rFonts w:ascii="Aptos Narrow" w:hAnsi="Aptos Narrow"/>
+          <w:color w:val="000000"/>
+        </w:rPr>
+      </w:pPr>
+    </w:p>
+    <w:p>
+      <w:pPr>
+        <w:rPr>
+          <w:rFonts w:ascii="Aptos Narrow" w:hAnsi="Aptos Narrow"/>
+          <w:color w:val="000000"/>
+        </w:rPr>
+      </w:pPr>
+      <w:r>
+        <w:rPr>
+          <w:rFonts w:ascii="Aptos Narrow" w:hAnsi="Aptos Narrow"/>
+          <w:color w:val="000000"/>
+        </w:rPr>
+        <w:t xml:space="preserve">38. </w:t>
       </w:r>
       <w:r>
         <w:rPr>
@@ -7477,7 +7725,7 @@
           <w:rFonts w:ascii="Aptos Narrow" w:hAnsi="Aptos Narrow"/>
           <w:color w:val="000000"/>
         </w:rPr>
-        <w:t xml:space="preserve">36. </w:t>
+        <w:t xml:space="preserve">39. </w:t>
       </w:r>
       <w:r>
         <w:rPr>
@@ -7491,7 +7739,23 @@
           <w:rFonts w:ascii="Aptos Narrow" w:hAnsi="Aptos Narrow"/>
           <w:color w:val="000000"/>
         </w:rPr>
-        <w:t xml:space="preserve"> Type ‘yes’ or ‘no’.</w:t>
+        <w:t xml:space="preserve"> Type ‘</w:t>
+      </w:r>
+      <w:proofErr w:type="spellStart"/>
+      <w:r>
+        <w:rPr>
+          <w:rFonts w:ascii="Aptos Narrow" w:hAnsi="Aptos Narrow"/>
+          <w:color w:val="000000"/>
+        </w:rPr>
+        <w:t>yes’</w:t>
+      </w:r>
+      <w:proofErr w:type="spellEnd"/>
+      <w:r>
+        <w:rPr>
+          <w:rFonts w:ascii="Aptos Narrow" w:hAnsi="Aptos Narrow"/>
+          <w:color w:val="000000"/>
+        </w:rPr>
+        <w:t xml:space="preserve"> or ‘no’.</w:t>
       </w:r>
     </w:p>
     <w:p>
@@ -7589,133 +7853,13 @@
           <w:color w:val="000000"/>
         </w:rPr>
       </w:pPr>
-    </w:p>
-    <w:p>
-      <w:pPr>
+      <w:r>
         <w:rPr>
           <w:rFonts w:ascii="Aptos Narrow" w:hAnsi="Aptos Narrow"/>
           <w:b/>
           <w:bCs/>
           <w:color w:val="000000"/>
         </w:rPr>
-      </w:pPr>
-    </w:p>
-    <w:p>
-      <w:pPr>
-        <w:rPr>
-          <w:rFonts w:ascii="Aptos Narrow" w:hAnsi="Aptos Narrow"/>
-          <w:b/>
-          <w:bCs/>
-          <w:color w:val="000000"/>
-        </w:rPr>
-      </w:pPr>
-    </w:p>
-    <w:p>
-      <w:pPr>
-        <w:rPr>
-          <w:rFonts w:ascii="Aptos Narrow" w:hAnsi="Aptos Narrow"/>
-          <w:b/>
-          <w:bCs/>
-          <w:color w:val="000000"/>
-        </w:rPr>
-      </w:pPr>
-    </w:p>
-    <w:p>
-      <w:pPr>
-        <w:rPr>
-          <w:rFonts w:ascii="Aptos Narrow" w:hAnsi="Aptos Narrow"/>
-          <w:b/>
-          <w:bCs/>
-          <w:color w:val="000000"/>
-        </w:rPr>
-      </w:pPr>
-    </w:p>
-    <w:p>
-      <w:pPr>
-        <w:rPr>
-          <w:rFonts w:ascii="Aptos Narrow" w:hAnsi="Aptos Narrow"/>
-          <w:b/>
-          <w:bCs/>
-          <w:color w:val="000000"/>
-        </w:rPr>
-      </w:pPr>
-    </w:p>
-    <w:p>
-      <w:pPr>
-        <w:rPr>
-          <w:rFonts w:ascii="Aptos Narrow" w:hAnsi="Aptos Narrow"/>
-          <w:b/>
-          <w:bCs/>
-          <w:color w:val="000000"/>
-        </w:rPr>
-      </w:pPr>
-    </w:p>
-    <w:p>
-      <w:pPr>
-        <w:rPr>
-          <w:rFonts w:ascii="Aptos Narrow" w:hAnsi="Aptos Narrow"/>
-          <w:b/>
-          <w:bCs/>
-          <w:color w:val="000000"/>
-        </w:rPr>
-      </w:pPr>
-    </w:p>
-    <w:p>
-      <w:pPr>
-        <w:rPr>
-          <w:rFonts w:ascii="Aptos Narrow" w:hAnsi="Aptos Narrow"/>
-          <w:b/>
-          <w:bCs/>
-          <w:color w:val="000000"/>
-        </w:rPr>
-      </w:pPr>
-    </w:p>
-    <w:p>
-      <w:pPr>
-        <w:rPr>
-          <w:rFonts w:ascii="Aptos Narrow" w:hAnsi="Aptos Narrow"/>
-          <w:b/>
-          <w:bCs/>
-          <w:color w:val="000000"/>
-        </w:rPr>
-      </w:pPr>
-    </w:p>
-    <w:p>
-      <w:pPr>
-        <w:rPr>
-          <w:rFonts w:ascii="Aptos Narrow" w:hAnsi="Aptos Narrow"/>
-          <w:b/>
-          <w:bCs/>
-          <w:color w:val="000000"/>
-        </w:rPr>
-      </w:pPr>
-    </w:p>
-    <w:p>
-      <w:pPr>
-        <w:rPr>
-          <w:rFonts w:ascii="Aptos Narrow" w:hAnsi="Aptos Narrow"/>
-          <w:b/>
-          <w:bCs/>
-          <w:color w:val="000000"/>
-        </w:rPr>
-      </w:pPr>
-    </w:p>
-    <w:p>
-      <w:pPr>
-        <w:rPr>
-          <w:rFonts w:ascii="Aptos Narrow" w:hAnsi="Aptos Narrow"/>
-          <w:b/>
-          <w:bCs/>
-          <w:color w:val="000000"/>
-        </w:rPr>
-      </w:pPr>
-      <w:r>
-        <w:rPr>
-          <w:rFonts w:ascii="Aptos Narrow" w:hAnsi="Aptos Narrow"/>
-          <w:b/>
-          <w:bCs/>
-          <w:color w:val="000000"/>
-        </w:rPr>
         <w:lastRenderedPageBreak/>
         <w:t>Falling Creek Reservoir</w:t>
       </w:r>
@@ -10378,7 +10522,21 @@
           <w:rFonts w:ascii="Aptos Narrow" w:hAnsi="Aptos Narrow"/>
           <w:color w:val="000000"/>
         </w:rPr>
-        <w:t xml:space="preserve">For Feb. 20, what is the corresponding TOC in mg/L of the </w:t>
+        <w:t>For Feb</w:t>
+      </w:r>
+      <w:r>
+        <w:rPr>
+          <w:rFonts w:ascii="Aptos Narrow" w:hAnsi="Aptos Narrow"/>
+          <w:color w:val="000000"/>
+        </w:rPr>
+        <w:t>ruary</w:t>
+      </w:r>
+      <w:r>
+        <w:rPr>
+          <w:rFonts w:ascii="Aptos Narrow" w:hAnsi="Aptos Narrow"/>
+          <w:color w:val="000000"/>
+        </w:rPr>
+        <w:t xml:space="preserve"> 20, what is the corresponding TOC in mg/L of the </w:t>
       </w:r>
       <w:proofErr w:type="spellStart"/>
       <w:r>
@@ -10425,7 +10583,7 @@
           <w:rFonts w:ascii="Aptos Narrow" w:hAnsi="Aptos Narrow"/>
           <w:color w:val="000000"/>
         </w:rPr>
-        <w:t xml:space="preserve">* 8.3 </w:t>
+        <w:t>* 3.5</w:t>
       </w:r>
     </w:p>
     <w:p>
@@ -10455,6 +10613,72 @@
           <w:rFonts w:ascii="Aptos Narrow" w:hAnsi="Aptos Narrow"/>
           <w:color w:val="000000"/>
         </w:rPr>
+        <w:t>Use your answer to Q28 and the required removal of TOC table to calculate how much TOC</w:t>
+      </w:r>
+      <w:r>
+        <w:rPr>
+          <w:rFonts w:ascii="Aptos Narrow" w:hAnsi="Aptos Narrow"/>
+          <w:color w:val="000000"/>
+        </w:rPr>
+        <w:t xml:space="preserve"> </w:t>
+      </w:r>
+      <w:r>
+        <w:rPr>
+          <w:rFonts w:ascii="Aptos Narrow" w:hAnsi="Aptos Narrow"/>
+          <w:color w:val="000000"/>
+        </w:rPr>
+        <w:t>in mg/L</w:t>
+      </w:r>
+      <w:r>
+        <w:rPr>
+          <w:rFonts w:ascii="Aptos Narrow" w:hAnsi="Aptos Narrow"/>
+          <w:color w:val="000000"/>
+        </w:rPr>
+        <w:t xml:space="preserve"> should be removed from the reservoir on February 20. Round your answer to the nearest tenth (e.g., 3.1).</w:t>
+      </w:r>
+    </w:p>
+    <w:p>
+      <w:pPr>
+        <w:rPr>
+          <w:rFonts w:ascii="Aptos Narrow" w:hAnsi="Aptos Narrow"/>
+          <w:color w:val="000000"/>
+        </w:rPr>
+      </w:pPr>
+      <w:r>
+        <w:rPr>
+          <w:rFonts w:ascii="Aptos Narrow" w:hAnsi="Aptos Narrow"/>
+          <w:color w:val="000000"/>
+        </w:rPr>
+        <w:t xml:space="preserve">* 1.2 </w:t>
+      </w:r>
+    </w:p>
+    <w:p>
+      <w:pPr>
+        <w:rPr>
+          <w:rFonts w:ascii="Aptos Narrow" w:hAnsi="Aptos Narrow"/>
+          <w:color w:val="000000"/>
+        </w:rPr>
+      </w:pPr>
+    </w:p>
+    <w:p>
+      <w:pPr>
+        <w:rPr>
+          <w:rFonts w:ascii="Aptos Narrow" w:hAnsi="Aptos Narrow"/>
+          <w:color w:val="000000"/>
+        </w:rPr>
+      </w:pPr>
+      <w:r>
+        <w:rPr>
+          <w:rFonts w:ascii="Aptos Narrow" w:hAnsi="Aptos Narrow"/>
+          <w:color w:val="000000"/>
+        </w:rPr>
+        <w:t xml:space="preserve">30. </w:t>
+      </w:r>
+      <w:r>
+        <w:rPr>
+          <w:rFonts w:ascii="Aptos Narrow" w:hAnsi="Aptos Narrow"/>
+          <w:color w:val="000000"/>
+        </w:rPr>
         <w:t xml:space="preserve">Which best describes the pattern in </w:t>
       </w:r>
       <w:proofErr w:type="spellStart"/>
@@ -10561,7 +10785,7 @@
           <w:rFonts w:ascii="Aptos Narrow" w:hAnsi="Aptos Narrow"/>
           <w:color w:val="000000"/>
         </w:rPr>
-        <w:t xml:space="preserve">30. </w:t>
+        <w:t xml:space="preserve">31. </w:t>
       </w:r>
       <w:r>
         <w:rPr>
@@ -10575,7 +10799,23 @@
           <w:rFonts w:ascii="Aptos Narrow" w:hAnsi="Aptos Narrow"/>
           <w:color w:val="000000"/>
         </w:rPr>
-        <w:t xml:space="preserve"> Type ‘yes’ or ‘no’.</w:t>
+        <w:t xml:space="preserve"> Type ‘</w:t>
+      </w:r>
+      <w:proofErr w:type="spellStart"/>
+      <w:r>
+        <w:rPr>
+          <w:rFonts w:ascii="Aptos Narrow" w:hAnsi="Aptos Narrow"/>
+          <w:color w:val="000000"/>
+        </w:rPr>
+        <w:t>yes’</w:t>
+      </w:r>
+      <w:proofErr w:type="spellEnd"/>
+      <w:r>
+        <w:rPr>
+          <w:rFonts w:ascii="Aptos Narrow" w:hAnsi="Aptos Narrow"/>
+          <w:color w:val="000000"/>
+        </w:rPr>
+        <w:t xml:space="preserve"> or ‘no’.</w:t>
       </w:r>
     </w:p>
     <w:p>
@@ -10646,14 +10886,28 @@
           <w:rFonts w:ascii="Aptos Narrow" w:hAnsi="Aptos Narrow"/>
           <w:color w:val="000000"/>
         </w:rPr>
-        <w:t xml:space="preserve">31. </w:t>
-      </w:r>
-      <w:r>
-        <w:rPr>
-          <w:rFonts w:ascii="Aptos Narrow" w:hAnsi="Aptos Narrow"/>
-          <w:color w:val="000000"/>
-        </w:rPr>
-        <w:t xml:space="preserve">For Apr. 15, what is the corresponding TOC in mg/L of the </w:t>
+        <w:t xml:space="preserve">32. </w:t>
+      </w:r>
+      <w:r>
+        <w:rPr>
+          <w:rFonts w:ascii="Aptos Narrow" w:hAnsi="Aptos Narrow"/>
+          <w:color w:val="000000"/>
+        </w:rPr>
+        <w:t>For Apr</w:t>
+      </w:r>
+      <w:r>
+        <w:rPr>
+          <w:rFonts w:ascii="Aptos Narrow" w:hAnsi="Aptos Narrow"/>
+          <w:color w:val="000000"/>
+        </w:rPr>
+        <w:t>il</w:t>
+      </w:r>
+      <w:r>
+        <w:rPr>
+          <w:rFonts w:ascii="Aptos Narrow" w:hAnsi="Aptos Narrow"/>
+          <w:color w:val="000000"/>
+        </w:rPr>
+        <w:t xml:space="preserve"> 15, what is the corresponding TOC in mg/L of the </w:t>
       </w:r>
       <w:proofErr w:type="spellStart"/>
       <w:r>
@@ -10700,30 +10954,124 @@
           <w:rFonts w:ascii="Aptos Narrow" w:hAnsi="Aptos Narrow"/>
           <w:color w:val="000000"/>
         </w:rPr>
-        <w:t xml:space="preserve">* 9.2 </w:t>
-      </w:r>
-    </w:p>
-    <w:p>
-      <w:pPr>
-        <w:rPr>
-          <w:rFonts w:ascii="Aptos Narrow" w:hAnsi="Aptos Narrow"/>
-          <w:color w:val="000000"/>
-        </w:rPr>
-      </w:pPr>
-    </w:p>
-    <w:p>
-      <w:pPr>
-        <w:rPr>
-          <w:rFonts w:ascii="Aptos Narrow" w:hAnsi="Aptos Narrow"/>
-          <w:color w:val="000000"/>
-        </w:rPr>
-      </w:pPr>
-      <w:r>
-        <w:rPr>
-          <w:rFonts w:ascii="Aptos Narrow" w:hAnsi="Aptos Narrow"/>
-          <w:color w:val="000000"/>
-        </w:rPr>
-        <w:t xml:space="preserve">32. </w:t>
+        <w:t xml:space="preserve">* 5.0 </w:t>
+      </w:r>
+    </w:p>
+    <w:p>
+      <w:pPr>
+        <w:rPr>
+          <w:rFonts w:ascii="Aptos Narrow" w:hAnsi="Aptos Narrow"/>
+          <w:color w:val="000000"/>
+        </w:rPr>
+      </w:pPr>
+    </w:p>
+    <w:p>
+      <w:pPr>
+        <w:rPr>
+          <w:rFonts w:ascii="Aptos Narrow" w:hAnsi="Aptos Narrow"/>
+          <w:color w:val="000000"/>
+        </w:rPr>
+      </w:pPr>
+      <w:r>
+        <w:rPr>
+          <w:rFonts w:ascii="Aptos Narrow" w:hAnsi="Aptos Narrow"/>
+          <w:color w:val="000000"/>
+        </w:rPr>
+        <w:t xml:space="preserve">33. </w:t>
+      </w:r>
+      <w:r>
+        <w:rPr>
+          <w:rFonts w:ascii="Aptos Narrow" w:hAnsi="Aptos Narrow"/>
+          <w:color w:val="000000"/>
+        </w:rPr>
+        <w:t>Use your answer to Q</w:t>
+      </w:r>
+      <w:r>
+        <w:rPr>
+          <w:rFonts w:ascii="Aptos Narrow" w:hAnsi="Aptos Narrow"/>
+          <w:color w:val="000000"/>
+        </w:rPr>
+        <w:t>33</w:t>
+      </w:r>
+      <w:r>
+        <w:rPr>
+          <w:rFonts w:ascii="Aptos Narrow" w:hAnsi="Aptos Narrow"/>
+          <w:color w:val="000000"/>
+        </w:rPr>
+        <w:t xml:space="preserve"> and the required removal of TOC table to calculate how much TOC</w:t>
+      </w:r>
+      <w:r>
+        <w:rPr>
+          <w:rFonts w:ascii="Aptos Narrow" w:hAnsi="Aptos Narrow"/>
+          <w:color w:val="000000"/>
+        </w:rPr>
+        <w:t xml:space="preserve"> </w:t>
+      </w:r>
+      <w:r>
+        <w:rPr>
+          <w:rFonts w:ascii="Aptos Narrow" w:hAnsi="Aptos Narrow"/>
+          <w:color w:val="000000"/>
+        </w:rPr>
+        <w:t>in mg/L</w:t>
+      </w:r>
+      <w:r>
+        <w:rPr>
+          <w:rFonts w:ascii="Aptos Narrow" w:hAnsi="Aptos Narrow"/>
+          <w:color w:val="000000"/>
+        </w:rPr>
+        <w:t xml:space="preserve"> should be removed from the reservoir on </w:t>
+      </w:r>
+      <w:r>
+        <w:rPr>
+          <w:rFonts w:ascii="Aptos Narrow" w:hAnsi="Aptos Narrow"/>
+          <w:color w:val="000000"/>
+        </w:rPr>
+        <w:t>April 15</w:t>
+      </w:r>
+      <w:r>
+        <w:rPr>
+          <w:rFonts w:ascii="Aptos Narrow" w:hAnsi="Aptos Narrow"/>
+          <w:color w:val="000000"/>
+        </w:rPr>
+        <w:t>. Round your answer to the nearest tenth (e.g., 3.1).</w:t>
+      </w:r>
+    </w:p>
+    <w:p>
+      <w:pPr>
+        <w:rPr>
+          <w:rFonts w:ascii="Aptos Narrow" w:hAnsi="Aptos Narrow"/>
+          <w:color w:val="000000"/>
+        </w:rPr>
+      </w:pPr>
+      <w:r>
+        <w:rPr>
+          <w:rFonts w:ascii="Aptos Narrow" w:hAnsi="Aptos Narrow"/>
+          <w:color w:val="000000"/>
+        </w:rPr>
+        <w:t>* 2.3</w:t>
+      </w:r>
+    </w:p>
+    <w:p>
+      <w:pPr>
+        <w:rPr>
+          <w:rFonts w:ascii="Aptos Narrow" w:hAnsi="Aptos Narrow"/>
+          <w:color w:val="000000"/>
+        </w:rPr>
+      </w:pPr>
+    </w:p>
+    <w:p>
+      <w:pPr>
+        <w:rPr>
+          <w:rFonts w:ascii="Aptos Narrow" w:hAnsi="Aptos Narrow"/>
+          <w:color w:val="000000"/>
+        </w:rPr>
+      </w:pPr>
+      <w:r>
+        <w:rPr>
+          <w:rFonts w:ascii="Aptos Narrow" w:hAnsi="Aptos Narrow"/>
+          <w:color w:val="000000"/>
+        </w:rPr>
+        <w:t xml:space="preserve">34. </w:t>
       </w:r>
       <w:r>
         <w:rPr>
@@ -10836,7 +11184,8 @@
           <w:rFonts w:ascii="Aptos Narrow" w:hAnsi="Aptos Narrow"/>
           <w:color w:val="000000"/>
         </w:rPr>
-        <w:t xml:space="preserve">33. </w:t>
+        <w:lastRenderedPageBreak/>
+        <w:t xml:space="preserve">35. </w:t>
       </w:r>
       <w:r>
         <w:rPr>
@@ -10850,7 +11199,23 @@
           <w:rFonts w:ascii="Aptos Narrow" w:hAnsi="Aptos Narrow"/>
           <w:color w:val="000000"/>
         </w:rPr>
-        <w:t xml:space="preserve"> Type ‘yes’ or ‘no’.</w:t>
+        <w:t xml:space="preserve"> Type ‘</w:t>
+      </w:r>
+      <w:proofErr w:type="spellStart"/>
+      <w:r>
+        <w:rPr>
+          <w:rFonts w:ascii="Aptos Narrow" w:hAnsi="Aptos Narrow"/>
+          <w:color w:val="000000"/>
+        </w:rPr>
+        <w:t>yes’</w:t>
+      </w:r>
+      <w:proofErr w:type="spellEnd"/>
+      <w:r>
+        <w:rPr>
+          <w:rFonts w:ascii="Aptos Narrow" w:hAnsi="Aptos Narrow"/>
+          <w:color w:val="000000"/>
+        </w:rPr>
+        <w:t xml:space="preserve"> or ‘no’.</w:t>
       </w:r>
     </w:p>
     <w:p>
@@ -10921,14 +11286,28 @@
           <w:rFonts w:ascii="Aptos Narrow" w:hAnsi="Aptos Narrow"/>
           <w:color w:val="000000"/>
         </w:rPr>
-        <w:t xml:space="preserve">34. </w:t>
-      </w:r>
-      <w:r>
-        <w:rPr>
-          <w:rFonts w:ascii="Aptos Narrow" w:hAnsi="Aptos Narrow"/>
-          <w:color w:val="000000"/>
-        </w:rPr>
-        <w:t xml:space="preserve">For Aug. 20, what is the corresponding TOC in mg/L of the </w:t>
+        <w:t xml:space="preserve">36. </w:t>
+      </w:r>
+      <w:r>
+        <w:rPr>
+          <w:rFonts w:ascii="Aptos Narrow" w:hAnsi="Aptos Narrow"/>
+          <w:color w:val="000000"/>
+        </w:rPr>
+        <w:t>For Aug</w:t>
+      </w:r>
+      <w:r>
+        <w:rPr>
+          <w:rFonts w:ascii="Aptos Narrow" w:hAnsi="Aptos Narrow"/>
+          <w:color w:val="000000"/>
+        </w:rPr>
+        <w:t>ust</w:t>
+      </w:r>
+      <w:r>
+        <w:rPr>
+          <w:rFonts w:ascii="Aptos Narrow" w:hAnsi="Aptos Narrow"/>
+          <w:color w:val="000000"/>
+        </w:rPr>
+        <w:t xml:space="preserve"> 20, what is the corresponding TOC in mg/L of the </w:t>
       </w:r>
       <w:proofErr w:type="spellStart"/>
       <w:r>
@@ -10975,30 +11354,124 @@
           <w:rFonts w:ascii="Aptos Narrow" w:hAnsi="Aptos Narrow"/>
           <w:color w:val="000000"/>
         </w:rPr>
-        <w:t xml:space="preserve">* 13.2 </w:t>
-      </w:r>
-    </w:p>
-    <w:p>
-      <w:pPr>
-        <w:rPr>
-          <w:rFonts w:ascii="Aptos Narrow" w:hAnsi="Aptos Narrow"/>
-          <w:color w:val="000000"/>
-        </w:rPr>
-      </w:pPr>
-    </w:p>
-    <w:p>
-      <w:pPr>
-        <w:rPr>
-          <w:rFonts w:ascii="Aptos Narrow" w:hAnsi="Aptos Narrow"/>
-          <w:color w:val="000000"/>
-        </w:rPr>
-      </w:pPr>
-      <w:r>
-        <w:rPr>
-          <w:rFonts w:ascii="Aptos Narrow" w:hAnsi="Aptos Narrow"/>
-          <w:color w:val="000000"/>
-        </w:rPr>
-        <w:t xml:space="preserve">35. </w:t>
+        <w:t xml:space="preserve">* 9.0 </w:t>
+      </w:r>
+    </w:p>
+    <w:p>
+      <w:pPr>
+        <w:rPr>
+          <w:rFonts w:ascii="Aptos Narrow" w:hAnsi="Aptos Narrow"/>
+          <w:color w:val="000000"/>
+        </w:rPr>
+      </w:pPr>
+    </w:p>
+    <w:p>
+      <w:pPr>
+        <w:rPr>
+          <w:rFonts w:ascii="Aptos Narrow" w:hAnsi="Aptos Narrow"/>
+          <w:color w:val="000000"/>
+        </w:rPr>
+      </w:pPr>
+      <w:r>
+        <w:rPr>
+          <w:rFonts w:ascii="Aptos Narrow" w:hAnsi="Aptos Narrow"/>
+          <w:color w:val="000000"/>
+        </w:rPr>
+        <w:t xml:space="preserve">37. </w:t>
+      </w:r>
+      <w:r>
+        <w:rPr>
+          <w:rFonts w:ascii="Aptos Narrow" w:hAnsi="Aptos Narrow"/>
+          <w:color w:val="000000"/>
+        </w:rPr>
+        <w:t>Use your answer to Q</w:t>
+      </w:r>
+      <w:r>
+        <w:rPr>
+          <w:rFonts w:ascii="Aptos Narrow" w:hAnsi="Aptos Narrow"/>
+          <w:color w:val="000000"/>
+        </w:rPr>
+        <w:t>36</w:t>
+      </w:r>
+      <w:r>
+        <w:rPr>
+          <w:rFonts w:ascii="Aptos Narrow" w:hAnsi="Aptos Narrow"/>
+          <w:color w:val="000000"/>
+        </w:rPr>
+        <w:t xml:space="preserve"> and the required removal of TOC table to calculate how much TOC</w:t>
+      </w:r>
+      <w:r>
+        <w:rPr>
+          <w:rFonts w:ascii="Aptos Narrow" w:hAnsi="Aptos Narrow"/>
+          <w:color w:val="000000"/>
+        </w:rPr>
+        <w:t xml:space="preserve"> </w:t>
+      </w:r>
+      <w:r>
+        <w:rPr>
+          <w:rFonts w:ascii="Aptos Narrow" w:hAnsi="Aptos Narrow"/>
+          <w:color w:val="000000"/>
+        </w:rPr>
+        <w:t>in mg/L</w:t>
+      </w:r>
+      <w:r>
+        <w:rPr>
+          <w:rFonts w:ascii="Aptos Narrow" w:hAnsi="Aptos Narrow"/>
+          <w:color w:val="000000"/>
+        </w:rPr>
+        <w:t xml:space="preserve"> should be removed from the reservoir on </w:t>
+      </w:r>
+      <w:r>
+        <w:rPr>
+          <w:rFonts w:ascii="Aptos Narrow" w:hAnsi="Aptos Narrow"/>
+          <w:color w:val="000000"/>
+        </w:rPr>
+        <w:t>August 20</w:t>
+      </w:r>
+      <w:r>
+        <w:rPr>
+          <w:rFonts w:ascii="Aptos Narrow" w:hAnsi="Aptos Narrow"/>
+          <w:color w:val="000000"/>
+        </w:rPr>
+        <w:t>. Round your answer to the nearest tenth (e.g., 3.1).</w:t>
+      </w:r>
+    </w:p>
+    <w:p>
+      <w:pPr>
+        <w:rPr>
+          <w:rFonts w:ascii="Aptos Narrow" w:hAnsi="Aptos Narrow"/>
+          <w:color w:val="000000"/>
+        </w:rPr>
+      </w:pPr>
+      <w:r>
+        <w:rPr>
+          <w:rFonts w:ascii="Aptos Narrow" w:hAnsi="Aptos Narrow"/>
+          <w:color w:val="000000"/>
+        </w:rPr>
+        <w:t>* 4.5</w:t>
+      </w:r>
+    </w:p>
+    <w:p>
+      <w:pPr>
+        <w:rPr>
+          <w:rFonts w:ascii="Aptos Narrow" w:hAnsi="Aptos Narrow"/>
+          <w:color w:val="000000"/>
+        </w:rPr>
+      </w:pPr>
+    </w:p>
+    <w:p>
+      <w:pPr>
+        <w:rPr>
+          <w:rFonts w:ascii="Aptos Narrow" w:hAnsi="Aptos Narrow"/>
+          <w:color w:val="000000"/>
+        </w:rPr>
+      </w:pPr>
+      <w:r>
+        <w:rPr>
+          <w:rFonts w:ascii="Aptos Narrow" w:hAnsi="Aptos Narrow"/>
+          <w:color w:val="000000"/>
+        </w:rPr>
+        <w:t xml:space="preserve">38. </w:t>
       </w:r>
       <w:r>
         <w:rPr>
@@ -11111,7 +11584,7 @@
           <w:rFonts w:ascii="Aptos Narrow" w:hAnsi="Aptos Narrow"/>
           <w:color w:val="000000"/>
         </w:rPr>
-        <w:t xml:space="preserve">36. </w:t>
+        <w:t xml:space="preserve">39. </w:t>
       </w:r>
       <w:r>
         <w:rPr>
@@ -11125,7 +11598,23 @@
           <w:rFonts w:ascii="Aptos Narrow" w:hAnsi="Aptos Narrow"/>
           <w:color w:val="000000"/>
         </w:rPr>
-        <w:t xml:space="preserve"> Type ‘yes’ or ‘no’.</w:t>
+        <w:t xml:space="preserve"> Type ‘</w:t>
+      </w:r>
+      <w:proofErr w:type="spellStart"/>
+      <w:r>
+        <w:rPr>
+          <w:rFonts w:ascii="Aptos Narrow" w:hAnsi="Aptos Narrow"/>
+          <w:color w:val="000000"/>
+        </w:rPr>
+        <w:t>yes’</w:t>
+      </w:r>
+      <w:proofErr w:type="spellEnd"/>
+      <w:r>
+        <w:rPr>
+          <w:rFonts w:ascii="Aptos Narrow" w:hAnsi="Aptos Narrow"/>
+          <w:color w:val="000000"/>
+        </w:rPr>
+        <w:t xml:space="preserve"> or ‘no’.</w:t>
       </w:r>
     </w:p>
     <w:p>
@@ -11164,45 +11653,9 @@
           <w:rFonts w:ascii="Aptos Narrow" w:hAnsi="Aptos Narrow"/>
           <w:color w:val="000000"/>
         </w:rPr>
-        <w:t xml:space="preserve">* </w:t>
-      </w:r>
-      <w:proofErr w:type="gramStart"/>
-      <w:r>
-        <w:rPr>
-          <w:rFonts w:ascii="Aptos Narrow" w:hAnsi="Aptos Narrow"/>
-          <w:color w:val="000000"/>
-        </w:rPr>
-        <w:t>no</w:t>
-      </w:r>
-      <w:proofErr w:type="gramEnd"/>
-    </w:p>
-    <w:p>
-      <w:pPr>
-        <w:rPr>
-          <w:rFonts w:ascii="Aptos Narrow" w:hAnsi="Aptos Narrow"/>
-          <w:color w:val="000000"/>
-        </w:rPr>
-      </w:pPr>
-    </w:p>
-    <w:p>
-      <w:pPr>
-        <w:rPr>
-          <w:rFonts w:ascii="Aptos Narrow" w:hAnsi="Aptos Narrow"/>
-          <w:color w:val="000000"/>
-        </w:rPr>
-      </w:pPr>
-    </w:p>
-    <w:p>
-      <w:pPr>
-        <w:rPr>
-          <w:rFonts w:ascii="Aptos Narrow" w:hAnsi="Aptos Narrow"/>
-          <w:b/>
-          <w:bCs/>
-          <w:color w:val="000000"/>
-        </w:rPr>
-      </w:pPr>
-    </w:p>
-    <w:p/>
+        <w:t>* no</w:t>
+      </w:r>
+    </w:p>
     <w:bookmarkEnd w:id="0"/>
     <w:bookmarkEnd w:id="1"/>
     <w:p>

</xml_diff>